<commit_message>
Add EdgeOs_Sim project document navigation, update main contents
</commit_message>
<xml_diff>
--- a/C/Project/EdgeOs_Sim/Doc/Description.docx
+++ b/C/Project/EdgeOs_Sim/Doc/Description.docx
@@ -9,6 +9,7 @@
           <w:ilvl w:val="0"/>
           <w:numId w:val="2"/>
         </w:numPr>
+        <w:outlineLvl w:val="0"/>
       </w:pPr>
       <w:r>
         <w:t>Bài toán</w:t>
@@ -21,6 +22,7 @@
           <w:ilvl w:val="0"/>
           <w:numId w:val="3"/>
         </w:numPr>
+        <w:outlineLvl w:val="1"/>
       </w:pPr>
       <w:r>
         <w:t>Prompt</w:t>
@@ -28,15 +30,7 @@
     </w:p>
     <w:p>
       <w:r>
-        <w:t xml:space="preserve">Một project đủ lớn để ép người làm dùng gần như toàn bộ </w:t>
-      </w:r>
-      <w:proofErr w:type="gramStart"/>
-      <w:r>
-        <w:t>C  từ</w:t>
-      </w:r>
-      <w:proofErr w:type="gramEnd"/>
-      <w:r>
-        <w:t xml:space="preserve"> language -&gt; compiler/linker -&gt; memory -&gt; concurrency -&gt; OS -&gt; networking -&gt; architecture -&gt; testing, đồng thời có hardware simulation nếu muốn cover embedded.</w:t>
+        <w:t>Một project đủ lớn để ép người làm dùng gần như toàn bộ C  từ language -&gt; compiler/linker -&gt; memory -&gt; concurrency -&gt; OS -&gt; networking -&gt; architecture -&gt; testing, đồng thời có hardware simulation nếu muốn cover embedded.</w:t>
       </w:r>
     </w:p>
     <w:p>
@@ -49,7 +43,13 @@
     </w:p>
     <w:p>
       <w:r>
-        <w:t>Ý tưởng là xây dựng một thiết ibj IoT/Industrical Controller ảo chạy trên PC.</w:t>
+        <w:t xml:space="preserve">Ý tưởng là xây dựng một thiết </w:t>
+      </w:r>
+      <w:r>
+        <w:t>bị</w:t>
+      </w:r>
+      <w:r>
+        <w:t xml:space="preserve"> IoT/Industrical Controller ảo chạy trên PC.</w:t>
       </w:r>
     </w:p>
     <w:p>
@@ -64,6 +64,7 @@
           <w:ilvl w:val="0"/>
           <w:numId w:val="3"/>
         </w:numPr>
+        <w:outlineLvl w:val="1"/>
       </w:pPr>
       <w:r>
         <w:t>Bài toán</w:t>
@@ -73,9 +74,10 @@
       <w:pPr>
         <w:pStyle w:val="ListParagraph"/>
         <w:numPr>
-          <w:ilvl w:val="2"/>
-          <w:numId w:val="3"/>
-        </w:numPr>
+          <w:ilvl w:val="1"/>
+          <w:numId w:val="3"/>
+        </w:numPr>
+        <w:outlineLvl w:val="2"/>
       </w:pPr>
       <w:r>
         <w:t>Bối cảnh thực tế</w:t>
@@ -310,9 +312,10 @@
       <w:pPr>
         <w:pStyle w:val="ListParagraph"/>
         <w:numPr>
-          <w:ilvl w:val="2"/>
-          <w:numId w:val="3"/>
-        </w:numPr>
+          <w:ilvl w:val="1"/>
+          <w:numId w:val="3"/>
+        </w:numPr>
+        <w:outlineLvl w:val="2"/>
       </w:pPr>
       <w:r>
         <w:t>Hệ thống nhìn từ bên ngoài</w:t>
@@ -322,9 +325,10 @@
       <w:pPr>
         <w:pStyle w:val="ListParagraph"/>
         <w:numPr>
-          <w:ilvl w:val="2"/>
-          <w:numId w:val="3"/>
-        </w:numPr>
+          <w:ilvl w:val="1"/>
+          <w:numId w:val="3"/>
+        </w:numPr>
+        <w:outlineLvl w:val="2"/>
       </w:pPr>
       <w:r>
         <w:t>Một use case cụ thể</w:t>
@@ -334,9 +338,10 @@
       <w:pPr>
         <w:pStyle w:val="ListParagraph"/>
         <w:numPr>
-          <w:ilvl w:val="2"/>
-          <w:numId w:val="3"/>
-        </w:numPr>
+          <w:ilvl w:val="1"/>
+          <w:numId w:val="3"/>
+        </w:numPr>
+        <w:outlineLvl w:val="2"/>
       </w:pPr>
       <w:r>
         <w:t>Nhưng requirement không đơn giản như vậy</w:t>
@@ -346,9 +351,10 @@
       <w:pPr>
         <w:pStyle w:val="ListParagraph"/>
         <w:numPr>
-          <w:ilvl w:val="2"/>
-          <w:numId w:val="3"/>
-        </w:numPr>
+          <w:ilvl w:val="1"/>
+          <w:numId w:val="3"/>
+        </w:numPr>
+        <w:outlineLvl w:val="2"/>
       </w:pPr>
       <w:r>
         <w:t>Hardware simulation</w:t>
@@ -358,9 +364,10 @@
       <w:pPr>
         <w:pStyle w:val="ListParagraph"/>
         <w:numPr>
-          <w:ilvl w:val="2"/>
-          <w:numId w:val="3"/>
-        </w:numPr>
+          <w:ilvl w:val="1"/>
+          <w:numId w:val="3"/>
+        </w:numPr>
+        <w:outlineLvl w:val="2"/>
       </w:pPr>
       <w:r>
         <w:t>Sensor simulation</w:t>
@@ -370,9 +377,10 @@
       <w:pPr>
         <w:pStyle w:val="ListParagraph"/>
         <w:numPr>
-          <w:ilvl w:val="2"/>
-          <w:numId w:val="3"/>
-        </w:numPr>
+          <w:ilvl w:val="1"/>
+          <w:numId w:val="3"/>
+        </w:numPr>
+        <w:outlineLvl w:val="2"/>
       </w:pPr>
       <w:r>
         <w:t>User interface</w:t>
@@ -382,12 +390,13 @@
       <w:pPr>
         <w:pStyle w:val="ListParagraph"/>
         <w:numPr>
-          <w:ilvl w:val="2"/>
-          <w:numId w:val="3"/>
-        </w:numPr>
-      </w:pPr>
-      <w:r>
-        <w:t>Final architecture</w:t>
+          <w:ilvl w:val="1"/>
+          <w:numId w:val="3"/>
+        </w:numPr>
+        <w:outlineLvl w:val="2"/>
+      </w:pPr>
+      <w:r>
+        <w:t>Kiến trúc cuối cùng</w:t>
       </w:r>
     </w:p>
     <w:p>
@@ -395,15 +404,526 @@
         <w:t>Đích đến:</w:t>
       </w:r>
     </w:p>
-    <w:p/>
-    <w:p>
-      <w:pPr>
-        <w:pStyle w:val="ListParagraph"/>
-        <w:numPr>
-          <w:ilvl w:val="0"/>
-          <w:numId w:val="3"/>
-        </w:numPr>
-      </w:pPr>
+    <w:p>
+      <w:pPr>
+        <w:pStyle w:val="ListParagraph"/>
+        <w:numPr>
+          <w:ilvl w:val="0"/>
+          <w:numId w:val="3"/>
+        </w:numPr>
+        <w:outlineLvl w:val="1"/>
+      </w:pPr>
+      <w:r>
+        <w:t>Những thứ project sẽ cover</w:t>
+      </w:r>
+    </w:p>
+    <w:p>
+      <w:pPr>
+        <w:pStyle w:val="ListParagraph"/>
+        <w:numPr>
+          <w:ilvl w:val="1"/>
+          <w:numId w:val="3"/>
+        </w:numPr>
+        <w:outlineLvl w:val="2"/>
+      </w:pPr>
+      <w:r>
+        <w:t>C language</w:t>
+      </w:r>
+    </w:p>
+    <w:p>
+      <w:pPr>
+        <w:pStyle w:val="ListParagraph"/>
+        <w:numPr>
+          <w:ilvl w:val="1"/>
+          <w:numId w:val="3"/>
+        </w:numPr>
+        <w:outlineLvl w:val="2"/>
+      </w:pPr>
+      <w:r>
+        <w:t>Advanced Pointer</w:t>
+      </w:r>
+    </w:p>
+    <w:p>
+      <w:pPr>
+        <w:pStyle w:val="ListParagraph"/>
+        <w:numPr>
+          <w:ilvl w:val="1"/>
+          <w:numId w:val="3"/>
+        </w:numPr>
+        <w:outlineLvl w:val="2"/>
+      </w:pPr>
+      <w:r>
+        <w:t>Memory Management</w:t>
+      </w:r>
+    </w:p>
+    <w:p>
+      <w:pPr>
+        <w:pStyle w:val="ListParagraph"/>
+        <w:numPr>
+          <w:ilvl w:val="1"/>
+          <w:numId w:val="3"/>
+        </w:numPr>
+        <w:outlineLvl w:val="2"/>
+      </w:pPr>
+      <w:r>
+        <w:t>Custom Data Structure</w:t>
+      </w:r>
+    </w:p>
+    <w:p>
+      <w:pPr>
+        <w:pStyle w:val="ListParagraph"/>
+        <w:numPr>
+          <w:ilvl w:val="1"/>
+          <w:numId w:val="3"/>
+        </w:numPr>
+        <w:outlineLvl w:val="2"/>
+      </w:pPr>
+      <w:r>
+        <w:t>Bit Manipulation</w:t>
+      </w:r>
+    </w:p>
+    <w:p>
+      <w:pPr>
+        <w:pStyle w:val="ListParagraph"/>
+        <w:numPr>
+          <w:ilvl w:val="1"/>
+          <w:numId w:val="3"/>
+        </w:numPr>
+        <w:outlineLvl w:val="2"/>
+      </w:pPr>
+      <w:r>
+        <w:t>Preprocessor Mastery</w:t>
+      </w:r>
+    </w:p>
+    <w:p>
+      <w:pPr>
+        <w:pStyle w:val="ListParagraph"/>
+        <w:numPr>
+          <w:ilvl w:val="1"/>
+          <w:numId w:val="3"/>
+        </w:numPr>
+        <w:outlineLvl w:val="2"/>
+      </w:pPr>
+      <w:r>
+        <w:t>Error Handling</w:t>
+      </w:r>
+    </w:p>
+    <w:p>
+      <w:pPr>
+        <w:pStyle w:val="ListParagraph"/>
+        <w:numPr>
+          <w:ilvl w:val="1"/>
+          <w:numId w:val="3"/>
+        </w:numPr>
+        <w:outlineLvl w:val="2"/>
+      </w:pPr>
+      <w:r>
+        <w:t>Design Patterns</w:t>
+      </w:r>
+    </w:p>
+    <w:p>
+      <w:pPr>
+        <w:pStyle w:val="ListParagraph"/>
+        <w:numPr>
+          <w:ilvl w:val="1"/>
+          <w:numId w:val="3"/>
+        </w:numPr>
+        <w:outlineLvl w:val="2"/>
+      </w:pPr>
+      <w:r>
+        <w:t>OOP uses C</w:t>
+      </w:r>
+    </w:p>
+    <w:p>
+      <w:pPr>
+        <w:pStyle w:val="ListParagraph"/>
+        <w:numPr>
+          <w:ilvl w:val="1"/>
+          <w:numId w:val="3"/>
+        </w:numPr>
+        <w:outlineLvl w:val="2"/>
+      </w:pPr>
+      <w:r>
+        <w:t>State Machine</w:t>
+      </w:r>
+    </w:p>
+    <w:p>
+      <w:pPr>
+        <w:pStyle w:val="ListParagraph"/>
+        <w:numPr>
+          <w:ilvl w:val="1"/>
+          <w:numId w:val="3"/>
+        </w:numPr>
+        <w:outlineLvl w:val="2"/>
+      </w:pPr>
+      <w:r>
+        <w:t>Event System</w:t>
+      </w:r>
+    </w:p>
+    <w:p>
+      <w:pPr>
+        <w:pStyle w:val="ListParagraph"/>
+        <w:numPr>
+          <w:ilvl w:val="1"/>
+          <w:numId w:val="3"/>
+        </w:numPr>
+        <w:outlineLvl w:val="2"/>
+      </w:pPr>
+      <w:r>
+        <w:t>Mini RTOS</w:t>
+      </w:r>
+    </w:p>
+    <w:p>
+      <w:pPr>
+        <w:pStyle w:val="ListParagraph"/>
+        <w:numPr>
+          <w:ilvl w:val="1"/>
+          <w:numId w:val="3"/>
+        </w:numPr>
+        <w:outlineLvl w:val="2"/>
+      </w:pPr>
+      <w:r>
+        <w:t>Concurrency</w:t>
+      </w:r>
+    </w:p>
+    <w:p>
+      <w:pPr>
+        <w:pStyle w:val="ListParagraph"/>
+        <w:numPr>
+          <w:ilvl w:val="1"/>
+          <w:numId w:val="3"/>
+        </w:numPr>
+        <w:outlineLvl w:val="2"/>
+      </w:pPr>
+      <w:r>
+        <w:t>Networking</w:t>
+      </w:r>
+    </w:p>
+    <w:p>
+      <w:pPr>
+        <w:pStyle w:val="ListParagraph"/>
+        <w:numPr>
+          <w:ilvl w:val="1"/>
+          <w:numId w:val="3"/>
+        </w:numPr>
+        <w:outlineLvl w:val="2"/>
+      </w:pPr>
+      <w:r>
+        <w:t>Simulated Hardware</w:t>
+      </w:r>
+    </w:p>
+    <w:p>
+      <w:pPr>
+        <w:pStyle w:val="ListParagraph"/>
+        <w:numPr>
+          <w:ilvl w:val="1"/>
+          <w:numId w:val="3"/>
+        </w:numPr>
+        <w:outlineLvl w:val="2"/>
+      </w:pPr>
+      <w:r>
+        <w:t>Flash/EEPROM Simulation</w:t>
+      </w:r>
+    </w:p>
+    <w:p>
+      <w:pPr>
+        <w:pStyle w:val="ListParagraph"/>
+        <w:numPr>
+          <w:ilvl w:val="1"/>
+          <w:numId w:val="3"/>
+        </w:numPr>
+        <w:outlineLvl w:val="2"/>
+      </w:pPr>
+      <w:r>
+        <w:t>Persistent Storage</w:t>
+      </w:r>
+    </w:p>
+    <w:p>
+      <w:pPr>
+        <w:pStyle w:val="ListParagraph"/>
+        <w:numPr>
+          <w:ilvl w:val="1"/>
+          <w:numId w:val="3"/>
+        </w:numPr>
+        <w:outlineLvl w:val="2"/>
+      </w:pPr>
+      <w:r>
+        <w:t>Logging Framework</w:t>
+      </w:r>
+    </w:p>
+    <w:p>
+      <w:pPr>
+        <w:pStyle w:val="ListParagraph"/>
+        <w:numPr>
+          <w:ilvl w:val="1"/>
+          <w:numId w:val="3"/>
+        </w:numPr>
+        <w:outlineLvl w:val="2"/>
+      </w:pPr>
+      <w:r>
+        <w:t>Diagnostics</w:t>
+      </w:r>
+    </w:p>
+    <w:p>
+      <w:pPr>
+        <w:pStyle w:val="ListParagraph"/>
+        <w:numPr>
+          <w:ilvl w:val="1"/>
+          <w:numId w:val="3"/>
+        </w:numPr>
+        <w:outlineLvl w:val="2"/>
+      </w:pPr>
+      <w:r>
+        <w:t>Configuration System</w:t>
+      </w:r>
+    </w:p>
+    <w:p>
+      <w:pPr>
+        <w:pStyle w:val="ListParagraph"/>
+        <w:numPr>
+          <w:ilvl w:val="1"/>
+          <w:numId w:val="3"/>
+        </w:numPr>
+        <w:outlineLvl w:val="2"/>
+      </w:pPr>
+      <w:r>
+        <w:t>Serialization</w:t>
+      </w:r>
+    </w:p>
+    <w:p>
+      <w:pPr>
+        <w:pStyle w:val="ListParagraph"/>
+        <w:numPr>
+          <w:ilvl w:val="1"/>
+          <w:numId w:val="3"/>
+        </w:numPr>
+        <w:outlineLvl w:val="2"/>
+      </w:pPr>
+      <w:r>
+        <w:t>Compiler/Linker Knowledge</w:t>
+      </w:r>
+    </w:p>
+    <w:p>
+      <w:pPr>
+        <w:pStyle w:val="ListParagraph"/>
+        <w:numPr>
+          <w:ilvl w:val="1"/>
+          <w:numId w:val="3"/>
+        </w:numPr>
+        <w:outlineLvl w:val="2"/>
+      </w:pPr>
+      <w:r>
+        <w:t>Custom Linker Script</w:t>
+      </w:r>
+    </w:p>
+    <w:p>
+      <w:pPr>
+        <w:pStyle w:val="ListParagraph"/>
+        <w:numPr>
+          <w:ilvl w:val="1"/>
+          <w:numId w:val="3"/>
+        </w:numPr>
+        <w:outlineLvl w:val="2"/>
+      </w:pPr>
+      <w:r>
+        <w:t>Plugin Architecture</w:t>
+      </w:r>
+    </w:p>
+    <w:p>
+      <w:pPr>
+        <w:pStyle w:val="ListParagraph"/>
+        <w:numPr>
+          <w:ilvl w:val="1"/>
+          <w:numId w:val="3"/>
+        </w:numPr>
+        <w:outlineLvl w:val="2"/>
+      </w:pPr>
+      <w:r>
+        <w:t>Testing</w:t>
+      </w:r>
+    </w:p>
+    <w:p>
+      <w:pPr>
+        <w:pStyle w:val="ListParagraph"/>
+        <w:numPr>
+          <w:ilvl w:val="1"/>
+          <w:numId w:val="3"/>
+        </w:numPr>
+        <w:outlineLvl w:val="2"/>
+      </w:pPr>
+      <w:r>
+        <w:lastRenderedPageBreak/>
+        <w:t>Fuzzing</w:t>
+      </w:r>
+    </w:p>
+    <w:p>
+      <w:pPr>
+        <w:pStyle w:val="ListParagraph"/>
+        <w:numPr>
+          <w:ilvl w:val="1"/>
+          <w:numId w:val="3"/>
+        </w:numPr>
+        <w:outlineLvl w:val="2"/>
+      </w:pPr>
+      <w:r>
+        <w:t>Static Analysis</w:t>
+      </w:r>
+    </w:p>
+    <w:p>
+      <w:pPr>
+        <w:pStyle w:val="ListParagraph"/>
+        <w:numPr>
+          <w:ilvl w:val="1"/>
+          <w:numId w:val="3"/>
+        </w:numPr>
+        <w:outlineLvl w:val="2"/>
+      </w:pPr>
+      <w:r>
+        <w:t>Debugging</w:t>
+      </w:r>
+    </w:p>
+    <w:p>
+      <w:pPr>
+        <w:pStyle w:val="ListParagraph"/>
+        <w:numPr>
+          <w:ilvl w:val="1"/>
+          <w:numId w:val="3"/>
+        </w:numPr>
+        <w:outlineLvl w:val="2"/>
+      </w:pPr>
+      <w:r>
+        <w:t>Performance Engineering</w:t>
+      </w:r>
+    </w:p>
+    <w:p>
+      <w:pPr>
+        <w:pStyle w:val="ListParagraph"/>
+        <w:numPr>
+          <w:ilvl w:val="1"/>
+          <w:numId w:val="3"/>
+        </w:numPr>
+        <w:outlineLvl w:val="2"/>
+      </w:pPr>
+      <w:r>
+        <w:t>Zero-Copy Architecture</w:t>
+      </w:r>
+    </w:p>
+    <w:p>
+      <w:pPr>
+        <w:pStyle w:val="ListParagraph"/>
+        <w:numPr>
+          <w:ilvl w:val="1"/>
+          <w:numId w:val="3"/>
+        </w:numPr>
+        <w:outlineLvl w:val="2"/>
+      </w:pPr>
+      <w:r>
+        <w:t>Fault Injection</w:t>
+      </w:r>
+    </w:p>
+    <w:p>
+      <w:pPr>
+        <w:pStyle w:val="ListParagraph"/>
+        <w:numPr>
+          <w:ilvl w:val="1"/>
+          <w:numId w:val="3"/>
+        </w:numPr>
+        <w:outlineLvl w:val="2"/>
+      </w:pPr>
+      <w:r>
+        <w:t>Watchdog Simulation</w:t>
+      </w:r>
+    </w:p>
+    <w:p>
+      <w:pPr>
+        <w:pStyle w:val="ListParagraph"/>
+        <w:numPr>
+          <w:ilvl w:val="1"/>
+          <w:numId w:val="3"/>
+        </w:numPr>
+        <w:outlineLvl w:val="2"/>
+      </w:pPr>
+      <w:r>
+        <w:t>Bootloader Simulation</w:t>
+      </w:r>
+    </w:p>
+    <w:p>
+      <w:pPr>
+        <w:pStyle w:val="ListParagraph"/>
+        <w:numPr>
+          <w:ilvl w:val="1"/>
+          <w:numId w:val="3"/>
+        </w:numPr>
+        <w:outlineLvl w:val="2"/>
+      </w:pPr>
+      <w:r>
+        <w:t>Build System</w:t>
+      </w:r>
+    </w:p>
+    <w:p>
+      <w:pPr>
+        <w:pStyle w:val="ListParagraph"/>
+        <w:numPr>
+          <w:ilvl w:val="1"/>
+          <w:numId w:val="3"/>
+        </w:numPr>
+        <w:outlineLvl w:val="2"/>
+      </w:pPr>
+      <w:r>
+        <w:t>Cross Compilation</w:t>
+      </w:r>
+    </w:p>
+    <w:p>
+      <w:pPr>
+        <w:pStyle w:val="ListParagraph"/>
+        <w:numPr>
+          <w:ilvl w:val="1"/>
+          <w:numId w:val="3"/>
+        </w:numPr>
+        <w:outlineLvl w:val="2"/>
+      </w:pPr>
+      <w:r>
+        <w:t>Architecture</w:t>
+      </w:r>
+    </w:p>
+    <w:p>
+      <w:pPr>
+        <w:pStyle w:val="ListParagraph"/>
+        <w:numPr>
+          <w:ilvl w:val="0"/>
+          <w:numId w:val="3"/>
+        </w:numPr>
+        <w:outlineLvl w:val="1"/>
+      </w:pPr>
+      <w:r>
+        <w:t>EdgeOs_Sim</w:t>
+      </w:r>
+    </w:p>
+    <w:p>
+      <w:pPr>
+        <w:pStyle w:val="ListParagraph"/>
+        <w:numPr>
+          <w:ilvl w:val="1"/>
+          <w:numId w:val="3"/>
+        </w:numPr>
+        <w:outlineLvl w:val="2"/>
+      </w:pPr>
+      <w:r>
+        <w:t>Project phải đạt được gì?</w:t>
+      </w:r>
+    </w:p>
+    <w:p>
+      <w:pPr>
+        <w:pStyle w:val="ListParagraph"/>
+        <w:numPr>
+          <w:ilvl w:val="1"/>
+          <w:numId w:val="3"/>
+        </w:numPr>
+        <w:outlineLvl w:val="2"/>
+      </w:pPr>
+      <w:r>
+        <w:t>Hardware sẽ được simulation</w:t>
+      </w:r>
     </w:p>
     <w:p>
       <w:pPr>
@@ -412,6 +932,7 @@
           <w:ilvl w:val="0"/>
           <w:numId w:val="2"/>
         </w:numPr>
+        <w:outlineLvl w:val="0"/>
       </w:pPr>
       <w:r>
         <w:t>Project EdgeOs_Sim</w:t>
@@ -424,6 +945,7 @@
           <w:ilvl w:val="0"/>
           <w:numId w:val="2"/>
         </w:numPr>
+        <w:outlineLvl w:val="0"/>
       </w:pPr>
       <w:r>
         <w:t>C Knowledge Map</w:t>
@@ -436,6 +958,7 @@
           <w:ilvl w:val="0"/>
           <w:numId w:val="2"/>
         </w:numPr>
+        <w:outlineLvl w:val="0"/>
       </w:pPr>
       <w:r>
         <w:t>Roadmap</w:t>
@@ -449,8 +972,210 @@
         <w:pStyle w:val="ListParagraph"/>
         <w:numPr>
           <w:ilvl w:val="0"/>
+          <w:numId w:val="5"/>
+        </w:numPr>
+        <w:outlineLvl w:val="1"/>
+      </w:pPr>
+      <w:r>
+        <w:t>Phase 0 – System &amp; Architecture</w:t>
+      </w:r>
+    </w:p>
+    <w:p>
+      <w:pPr>
+        <w:pStyle w:val="ListParagraph"/>
+        <w:numPr>
+          <w:ilvl w:val="0"/>
+          <w:numId w:val="5"/>
+        </w:numPr>
+        <w:outlineLvl w:val="1"/>
+      </w:pPr>
+      <w:r>
+        <w:t>Phase 1 – C Language &amp; Memory</w:t>
+      </w:r>
+    </w:p>
+    <w:p>
+      <w:pPr>
+        <w:pStyle w:val="ListParagraph"/>
+        <w:numPr>
+          <w:ilvl w:val="0"/>
+          <w:numId w:val="5"/>
+        </w:numPr>
+        <w:outlineLvl w:val="1"/>
+      </w:pPr>
+      <w:r>
+        <w:t>Phase 2 – Data Structure &amp; Generic C</w:t>
+      </w:r>
+    </w:p>
+    <w:p>
+      <w:pPr>
+        <w:pStyle w:val="ListParagraph"/>
+        <w:numPr>
+          <w:ilvl w:val="0"/>
+          <w:numId w:val="5"/>
+        </w:numPr>
+        <w:outlineLvl w:val="1"/>
+      </w:pPr>
+      <w:r>
+        <w:t>Phase 3 – Object Model &amp; Design Patterns</w:t>
+      </w:r>
+    </w:p>
+    <w:p>
+      <w:pPr>
+        <w:pStyle w:val="ListParagraph"/>
+        <w:numPr>
+          <w:ilvl w:val="0"/>
+          <w:numId w:val="5"/>
+        </w:numPr>
+        <w:outlineLvl w:val="1"/>
+      </w:pPr>
+      <w:r>
+        <w:t>Phase 4 – Hardware Simulation &amp; HAL</w:t>
+      </w:r>
+    </w:p>
+    <w:p>
+      <w:pPr>
+        <w:pStyle w:val="ListParagraph"/>
+        <w:numPr>
+          <w:ilvl w:val="0"/>
+          <w:numId w:val="5"/>
+        </w:numPr>
+        <w:outlineLvl w:val="1"/>
+      </w:pPr>
+      <w:r>
+        <w:t>Phase 5 – Drvier &amp; Protocol</w:t>
+      </w:r>
+    </w:p>
+    <w:p>
+      <w:pPr>
+        <w:pStyle w:val="ListParagraph"/>
+        <w:numPr>
+          <w:ilvl w:val="0"/>
+          <w:numId w:val="5"/>
+        </w:numPr>
+        <w:outlineLvl w:val="1"/>
+      </w:pPr>
+      <w:r>
+        <w:t>Phase 6 – Event-Driven Architecture</w:t>
+      </w:r>
+    </w:p>
+    <w:p>
+      <w:pPr>
+        <w:pStyle w:val="ListParagraph"/>
+        <w:numPr>
+          <w:ilvl w:val="0"/>
+          <w:numId w:val="5"/>
+        </w:numPr>
+        <w:outlineLvl w:val="1"/>
+      </w:pPr>
+      <w:r>
+        <w:t>Phase 7 – Mini RTOS</w:t>
+      </w:r>
+    </w:p>
+    <w:p>
+      <w:pPr>
+        <w:pStyle w:val="ListParagraph"/>
+        <w:numPr>
+          <w:ilvl w:val="0"/>
+          <w:numId w:val="5"/>
+        </w:numPr>
+        <w:outlineLvl w:val="1"/>
+      </w:pPr>
+      <w:r>
+        <w:t>Phase 8 – Concurrency</w:t>
+      </w:r>
+    </w:p>
+    <w:p>
+      <w:pPr>
+        <w:pStyle w:val="ListParagraph"/>
+        <w:numPr>
+          <w:ilvl w:val="0"/>
+          <w:numId w:val="5"/>
+        </w:numPr>
+        <w:outlineLvl w:val="1"/>
+      </w:pPr>
+      <w:r>
+        <w:t>Phase 9 – Storage &amp; Networking</w:t>
+      </w:r>
+    </w:p>
+    <w:p>
+      <w:pPr>
+        <w:pStyle w:val="ListParagraph"/>
+        <w:numPr>
+          <w:ilvl w:val="0"/>
+          <w:numId w:val="5"/>
+        </w:numPr>
+        <w:outlineLvl w:val="1"/>
+      </w:pPr>
+      <w:r>
+        <w:t>Phase 10 – Bootloader &amp; OTA</w:t>
+      </w:r>
+    </w:p>
+    <w:p>
+      <w:pPr>
+        <w:pStyle w:val="ListParagraph"/>
+        <w:numPr>
+          <w:ilvl w:val="0"/>
+          <w:numId w:val="5"/>
+        </w:numPr>
+        <w:outlineLvl w:val="1"/>
+      </w:pPr>
+      <w:r>
+        <w:t>Phase 11 – Diagnostics &amp; Debugging &amp; Quality</w:t>
+      </w:r>
+    </w:p>
+    <w:p>
+      <w:pPr>
+        <w:pStyle w:val="ListParagraph"/>
+        <w:numPr>
+          <w:ilvl w:val="0"/>
+          <w:numId w:val="5"/>
+        </w:numPr>
+        <w:outlineLvl w:val="1"/>
+      </w:pPr>
+      <w:r>
+        <w:t>Phase 12 – Compiler/Linker/ABI/Expert</w:t>
+      </w:r>
+    </w:p>
+    <w:p>
+      <w:pPr>
+        <w:pStyle w:val="ListParagraph"/>
+        <w:numPr>
+          <w:ilvl w:val="0"/>
+          <w:numId w:val="5"/>
+        </w:numPr>
+        <w:outlineLvl w:val="1"/>
+      </w:pPr>
+      <w:r>
+        <w:t xml:space="preserve">Phase 13 </w:t>
+      </w:r>
+      <w:r>
+        <w:t>–</w:t>
+      </w:r>
+      <w:r>
+        <w:t xml:space="preserve"> Performance</w:t>
+      </w:r>
+    </w:p>
+    <w:p>
+      <w:pPr>
+        <w:pStyle w:val="ListParagraph"/>
+        <w:numPr>
+          <w:ilvl w:val="0"/>
+          <w:numId w:val="5"/>
+        </w:numPr>
+        <w:outlineLvl w:val="1"/>
+      </w:pPr>
+      <w:r>
+        <w:t>Phase 14 – Final Integration</w:t>
+      </w:r>
+    </w:p>
+    <w:p>
+      <w:pPr>
+        <w:pStyle w:val="ListParagraph"/>
+        <w:numPr>
+          <w:ilvl w:val="0"/>
           <w:numId w:val="2"/>
         </w:numPr>
+        <w:outlineLvl w:val="0"/>
       </w:pPr>
       <w:r>
         <w:t>Final Expert Challenge</w:t>
@@ -461,10 +1186,77 @@
         <w:pStyle w:val="ListParagraph"/>
         <w:numPr>
           <w:ilvl w:val="0"/>
+          <w:numId w:val="6"/>
+        </w:numPr>
+        <w:outlineLvl w:val="1"/>
+      </w:pPr>
+      <w:r>
+        <w:t>E1 – Remove malloc()</w:t>
+      </w:r>
+    </w:p>
+    <w:p>
+      <w:pPr>
+        <w:pStyle w:val="ListParagraph"/>
+        <w:numPr>
+          <w:ilvl w:val="0"/>
+          <w:numId w:val="6"/>
+        </w:numPr>
+        <w:outlineLvl w:val="1"/>
+      </w:pPr>
+      <w:r>
+        <w:t>E2 – Replace Hardware Simulator</w:t>
+      </w:r>
+    </w:p>
+    <w:p>
+      <w:pPr>
+        <w:pStyle w:val="ListParagraph"/>
+        <w:numPr>
+          <w:ilvl w:val="0"/>
+          <w:numId w:val="6"/>
+        </w:numPr>
+        <w:outlineLvl w:val="1"/>
+      </w:pPr>
+      <w:r>
+        <w:t>E3 – Replace RTOS</w:t>
+      </w:r>
+    </w:p>
+    <w:p>
+      <w:pPr>
+        <w:pStyle w:val="ListParagraph"/>
+        <w:numPr>
+          <w:ilvl w:val="0"/>
+          <w:numId w:val="6"/>
+        </w:numPr>
+        <w:outlineLvl w:val="1"/>
+      </w:pPr>
+      <w:r>
+        <w:t>E4 – Build a Minimal Device</w:t>
+      </w:r>
+    </w:p>
+    <w:p>
+      <w:pPr>
+        <w:pStyle w:val="ListParagraph"/>
+        <w:numPr>
+          <w:ilvl w:val="0"/>
+          <w:numId w:val="6"/>
+        </w:numPr>
+        <w:outlineLvl w:val="1"/>
+      </w:pPr>
+      <w:r>
+        <w:t>E5 – Architecture Review</w:t>
+      </w:r>
+    </w:p>
+    <w:p>
+      <w:pPr>
+        <w:pStyle w:val="ListParagraph"/>
+        <w:numPr>
+          <w:ilvl w:val="0"/>
           <w:numId w:val="2"/>
         </w:numPr>
-      </w:pPr>
-      <w:r>
+        <w:outlineLvl w:val="0"/>
+      </w:pPr>
+      <w:r>
+        <w:lastRenderedPageBreak/>
         <w:t>C Knowledge Coverage Matrix</w:t>
       </w:r>
     </w:p>
@@ -481,6 +1273,410 @@
 <file path=word/numbering.xml><?xml version="1.0" encoding="utf-8"?>
 <w:numbering xmlns:wpc="http://schemas.microsoft.com/office/word/2010/wordprocessingCanvas" xmlns:cx="http://schemas.microsoft.com/office/drawing/2014/chartex" xmlns:cx1="http://schemas.microsoft.com/office/drawing/2015/9/8/chartex" xmlns:cx2="http://schemas.microsoft.com/office/drawing/2015/10/21/chartex" xmlns:cx3="http://schemas.microsoft.com/office/drawing/2016/5/9/chartex" xmlns:cx4="http://schemas.microsoft.com/office/drawing/2016/5/10/chartex" xmlns:cx5="http://schemas.microsoft.com/office/drawing/2016/5/11/chartex" xmlns:cx6="http://schemas.microsoft.com/office/drawing/2016/5/12/chartex" xmlns:cx7="http://schemas.microsoft.com/office/drawing/2016/5/13/chartex" xmlns:cx8="http://schemas.microsoft.com/office/drawing/2016/5/14/chartex" xmlns:mc="http://schemas.openxmlformats.org/markup-compatibility/2006" xmlns:aink="http://schemas.microsoft.com/office/drawing/2016/ink" xmlns:am3d="http://schemas.microsoft.com/office/drawing/2017/model3d" xmlns:o="urn:schemas-microsoft-com:office:office" xmlns:oel="http://schemas.microsoft.com/office/2019/extlst" xmlns:r="http://schemas.openxmlformats.org/officeDocument/2006/relationships" xmlns:m="http://schemas.openxmlformats.org/officeDocument/2006/math" xmlns:v="urn:schemas-microsoft-com:vml" xmlns:wp14="http://schemas.microsoft.com/office/word/2010/wordprocessingDrawing" xmlns:wp="http://schemas.openxmlformats.org/drawingml/2006/wordprocessingDrawing" xmlns:w10="urn:schemas-microsoft-com:office:word" xmlns:w="http://schemas.openxmlformats.org/wordprocessingml/2006/main" xmlns:w14="http://schemas.microsoft.com/office/word/2010/wordml" xmlns:w15="http://schemas.microsoft.com/office/word/2012/wordml" xmlns:w16cex="http://schemas.microsoft.com/office/word/2018/wordml/cex" xmlns:w16cid="http://schemas.microsoft.com/office/word/2016/wordml/cid" xmlns:w16="http://schemas.microsoft.com/office/word/2018/wordml" xmlns:w16du="http://schemas.microsoft.com/office/word/2023/wordml/word16du" xmlns:w16sdtdh="http://schemas.microsoft.com/office/word/2020/wordml/sdtdatahash" xmlns:w16sdtfl="http://schemas.microsoft.com/office/word/2024/wordml/sdtformatlock" xmlns:w16se="http://schemas.microsoft.com/office/word/2015/wordml/symex" xmlns:wpg="http://schemas.microsoft.com/office/word/2010/wordprocessingGroup" xmlns:wpi="http://schemas.microsoft.com/office/word/2010/wordprocessingInk" xmlns:wne="http://schemas.microsoft.com/office/word/2006/wordml" xmlns:wps="http://schemas.microsoft.com/office/word/2010/wordprocessingShape" mc:Ignorable="w14 w15 w16se w16cid w16 w16cex w16sdtdh w16sdtfl w16du wp14">
   <w:abstractNum w:abstractNumId="0" w15:restartNumberingAfterBreak="0">
+    <w:nsid w:val="0B323630"/>
+    <w:multiLevelType w:val="hybridMultilevel"/>
+    <w:tmpl w:val="7E365F38"/>
+    <w:lvl w:ilvl="0" w:tplc="8BEA364C">
+      <w:start w:val="1"/>
+      <w:numFmt w:val="decimal"/>
+      <w:lvlText w:val="%1."/>
+      <w:lvlJc w:val="left"/>
+      <w:pPr>
+        <w:ind w:left="1440" w:hanging="360"/>
+      </w:pPr>
+      <w:rPr>
+        <w:rFonts w:hint="default"/>
+      </w:rPr>
+    </w:lvl>
+    <w:lvl w:ilvl="1" w:tplc="04090019">
+      <w:start w:val="1"/>
+      <w:numFmt w:val="lowerLetter"/>
+      <w:lvlText w:val="%2."/>
+      <w:lvlJc w:val="left"/>
+      <w:pPr>
+        <w:ind w:left="2160" w:hanging="360"/>
+      </w:pPr>
+    </w:lvl>
+    <w:lvl w:ilvl="2" w:tplc="0409001B" w:tentative="1">
+      <w:start w:val="1"/>
+      <w:numFmt w:val="lowerRoman"/>
+      <w:lvlText w:val="%3."/>
+      <w:lvlJc w:val="right"/>
+      <w:pPr>
+        <w:ind w:left="2880" w:hanging="180"/>
+      </w:pPr>
+    </w:lvl>
+    <w:lvl w:ilvl="3" w:tplc="0409000F" w:tentative="1">
+      <w:start w:val="1"/>
+      <w:numFmt w:val="decimal"/>
+      <w:lvlText w:val="%4."/>
+      <w:lvlJc w:val="left"/>
+      <w:pPr>
+        <w:ind w:left="3600" w:hanging="360"/>
+      </w:pPr>
+    </w:lvl>
+    <w:lvl w:ilvl="4" w:tplc="04090019" w:tentative="1">
+      <w:start w:val="1"/>
+      <w:numFmt w:val="lowerLetter"/>
+      <w:lvlText w:val="%5."/>
+      <w:lvlJc w:val="left"/>
+      <w:pPr>
+        <w:ind w:left="4320" w:hanging="360"/>
+      </w:pPr>
+    </w:lvl>
+    <w:lvl w:ilvl="5" w:tplc="0409001B" w:tentative="1">
+      <w:start w:val="1"/>
+      <w:numFmt w:val="lowerRoman"/>
+      <w:lvlText w:val="%6."/>
+      <w:lvlJc w:val="right"/>
+      <w:pPr>
+        <w:ind w:left="5040" w:hanging="180"/>
+      </w:pPr>
+    </w:lvl>
+    <w:lvl w:ilvl="6" w:tplc="0409000F" w:tentative="1">
+      <w:start w:val="1"/>
+      <w:numFmt w:val="decimal"/>
+      <w:lvlText w:val="%7."/>
+      <w:lvlJc w:val="left"/>
+      <w:pPr>
+        <w:ind w:left="5760" w:hanging="360"/>
+      </w:pPr>
+    </w:lvl>
+    <w:lvl w:ilvl="7" w:tplc="04090019" w:tentative="1">
+      <w:start w:val="1"/>
+      <w:numFmt w:val="lowerLetter"/>
+      <w:lvlText w:val="%8."/>
+      <w:lvlJc w:val="left"/>
+      <w:pPr>
+        <w:ind w:left="6480" w:hanging="360"/>
+      </w:pPr>
+    </w:lvl>
+    <w:lvl w:ilvl="8" w:tplc="0409001B" w:tentative="1">
+      <w:start w:val="1"/>
+      <w:numFmt w:val="lowerRoman"/>
+      <w:lvlText w:val="%9."/>
+      <w:lvlJc w:val="right"/>
+      <w:pPr>
+        <w:ind w:left="7200" w:hanging="180"/>
+      </w:pPr>
+    </w:lvl>
+  </w:abstractNum>
+  <w:abstractNum w:abstractNumId="1" w15:restartNumberingAfterBreak="0">
+    <w:nsid w:val="0C776537"/>
+    <w:multiLevelType w:val="multilevel"/>
+    <w:tmpl w:val="54C09CF6"/>
+    <w:lvl w:ilvl="0">
+      <w:start w:val="2"/>
+      <w:numFmt w:val="decimal"/>
+      <w:lvlText w:val="%1"/>
+      <w:lvlJc w:val="left"/>
+      <w:pPr>
+        <w:ind w:left="480" w:hanging="480"/>
+      </w:pPr>
+      <w:rPr>
+        <w:rFonts w:hint="default"/>
+      </w:rPr>
+    </w:lvl>
+    <w:lvl w:ilvl="1">
+      <w:start w:val="8"/>
+      <w:numFmt w:val="decimal"/>
+      <w:lvlText w:val="%1.%2"/>
+      <w:lvlJc w:val="left"/>
+      <w:pPr>
+        <w:ind w:left="1560" w:hanging="480"/>
+      </w:pPr>
+      <w:rPr>
+        <w:rFonts w:hint="default"/>
+      </w:rPr>
+    </w:lvl>
+    <w:lvl w:ilvl="2">
+      <w:start w:val="8"/>
+      <w:numFmt w:val="decimal"/>
+      <w:lvlText w:val="%1.%2.%3"/>
+      <w:lvlJc w:val="left"/>
+      <w:pPr>
+        <w:ind w:left="2880" w:hanging="720"/>
+      </w:pPr>
+      <w:rPr>
+        <w:rFonts w:hint="default"/>
+      </w:rPr>
+    </w:lvl>
+    <w:lvl w:ilvl="3">
+      <w:start w:val="1"/>
+      <w:numFmt w:val="decimal"/>
+      <w:lvlText w:val="%1.%2.%3.%4"/>
+      <w:lvlJc w:val="left"/>
+      <w:pPr>
+        <w:ind w:left="3960" w:hanging="720"/>
+      </w:pPr>
+      <w:rPr>
+        <w:rFonts w:hint="default"/>
+      </w:rPr>
+    </w:lvl>
+    <w:lvl w:ilvl="4">
+      <w:start w:val="1"/>
+      <w:numFmt w:val="decimal"/>
+      <w:lvlText w:val="%1.%2.%3.%4.%5"/>
+      <w:lvlJc w:val="left"/>
+      <w:pPr>
+        <w:ind w:left="5400" w:hanging="1080"/>
+      </w:pPr>
+      <w:rPr>
+        <w:rFonts w:hint="default"/>
+      </w:rPr>
+    </w:lvl>
+    <w:lvl w:ilvl="5">
+      <w:start w:val="1"/>
+      <w:numFmt w:val="decimal"/>
+      <w:lvlText w:val="%1.%2.%3.%4.%5.%6"/>
+      <w:lvlJc w:val="left"/>
+      <w:pPr>
+        <w:ind w:left="6480" w:hanging="1080"/>
+      </w:pPr>
+      <w:rPr>
+        <w:rFonts w:hint="default"/>
+      </w:rPr>
+    </w:lvl>
+    <w:lvl w:ilvl="6">
+      <w:start w:val="1"/>
+      <w:numFmt w:val="decimal"/>
+      <w:lvlText w:val="%1.%2.%3.%4.%5.%6.%7"/>
+      <w:lvlJc w:val="left"/>
+      <w:pPr>
+        <w:ind w:left="7920" w:hanging="1440"/>
+      </w:pPr>
+      <w:rPr>
+        <w:rFonts w:hint="default"/>
+      </w:rPr>
+    </w:lvl>
+    <w:lvl w:ilvl="7">
+      <w:start w:val="1"/>
+      <w:numFmt w:val="decimal"/>
+      <w:lvlText w:val="%1.%2.%3.%4.%5.%6.%7.%8"/>
+      <w:lvlJc w:val="left"/>
+      <w:pPr>
+        <w:ind w:left="9000" w:hanging="1440"/>
+      </w:pPr>
+      <w:rPr>
+        <w:rFonts w:hint="default"/>
+      </w:rPr>
+    </w:lvl>
+    <w:lvl w:ilvl="8">
+      <w:start w:val="1"/>
+      <w:numFmt w:val="decimal"/>
+      <w:lvlText w:val="%1.%2.%3.%4.%5.%6.%7.%8.%9"/>
+      <w:lvlJc w:val="left"/>
+      <w:pPr>
+        <w:ind w:left="10440" w:hanging="1800"/>
+      </w:pPr>
+      <w:rPr>
+        <w:rFonts w:hint="default"/>
+      </w:rPr>
+    </w:lvl>
+  </w:abstractNum>
+  <w:abstractNum w:abstractNumId="2" w15:restartNumberingAfterBreak="0">
+    <w:nsid w:val="14CC0BEF"/>
+    <w:multiLevelType w:val="multilevel"/>
+    <w:tmpl w:val="08ECAAFE"/>
+    <w:lvl w:ilvl="0">
+      <w:start w:val="2"/>
+      <w:numFmt w:val="decimal"/>
+      <w:lvlText w:val="%1"/>
+      <w:lvlJc w:val="left"/>
+      <w:pPr>
+        <w:ind w:left="360" w:hanging="360"/>
+      </w:pPr>
+      <w:rPr>
+        <w:rFonts w:hint="default"/>
+      </w:rPr>
+    </w:lvl>
+    <w:lvl w:ilvl="1">
+      <w:start w:val="3"/>
+      <w:numFmt w:val="decimal"/>
+      <w:lvlText w:val="%1.%2"/>
+      <w:lvlJc w:val="left"/>
+      <w:pPr>
+        <w:ind w:left="2520" w:hanging="360"/>
+      </w:pPr>
+      <w:rPr>
+        <w:rFonts w:hint="default"/>
+      </w:rPr>
+    </w:lvl>
+    <w:lvl w:ilvl="2">
+      <w:start w:val="1"/>
+      <w:numFmt w:val="decimal"/>
+      <w:lvlText w:val="%1.%2.%3"/>
+      <w:lvlJc w:val="left"/>
+      <w:pPr>
+        <w:ind w:left="5040" w:hanging="720"/>
+      </w:pPr>
+      <w:rPr>
+        <w:rFonts w:hint="default"/>
+      </w:rPr>
+    </w:lvl>
+    <w:lvl w:ilvl="3">
+      <w:start w:val="1"/>
+      <w:numFmt w:val="decimal"/>
+      <w:lvlText w:val="%1.%2.%3.%4"/>
+      <w:lvlJc w:val="left"/>
+      <w:pPr>
+        <w:ind w:left="7200" w:hanging="720"/>
+      </w:pPr>
+      <w:rPr>
+        <w:rFonts w:hint="default"/>
+      </w:rPr>
+    </w:lvl>
+    <w:lvl w:ilvl="4">
+      <w:start w:val="1"/>
+      <w:numFmt w:val="decimal"/>
+      <w:lvlText w:val="%1.%2.%3.%4.%5"/>
+      <w:lvlJc w:val="left"/>
+      <w:pPr>
+        <w:ind w:left="9720" w:hanging="1080"/>
+      </w:pPr>
+      <w:rPr>
+        <w:rFonts w:hint="default"/>
+      </w:rPr>
+    </w:lvl>
+    <w:lvl w:ilvl="5">
+      <w:start w:val="1"/>
+      <w:numFmt w:val="decimal"/>
+      <w:lvlText w:val="%1.%2.%3.%4.%5.%6"/>
+      <w:lvlJc w:val="left"/>
+      <w:pPr>
+        <w:ind w:left="11880" w:hanging="1080"/>
+      </w:pPr>
+      <w:rPr>
+        <w:rFonts w:hint="default"/>
+      </w:rPr>
+    </w:lvl>
+    <w:lvl w:ilvl="6">
+      <w:start w:val="1"/>
+      <w:numFmt w:val="decimal"/>
+      <w:lvlText w:val="%1.%2.%3.%4.%5.%6.%7"/>
+      <w:lvlJc w:val="left"/>
+      <w:pPr>
+        <w:ind w:left="14400" w:hanging="1440"/>
+      </w:pPr>
+      <w:rPr>
+        <w:rFonts w:hint="default"/>
+      </w:rPr>
+    </w:lvl>
+    <w:lvl w:ilvl="7">
+      <w:start w:val="1"/>
+      <w:numFmt w:val="decimal"/>
+      <w:lvlText w:val="%1.%2.%3.%4.%5.%6.%7.%8"/>
+      <w:lvlJc w:val="left"/>
+      <w:pPr>
+        <w:ind w:left="16560" w:hanging="1440"/>
+      </w:pPr>
+      <w:rPr>
+        <w:rFonts w:hint="default"/>
+      </w:rPr>
+    </w:lvl>
+    <w:lvl w:ilvl="8">
+      <w:start w:val="1"/>
+      <w:numFmt w:val="decimal"/>
+      <w:lvlText w:val="%1.%2.%3.%4.%5.%6.%7.%8.%9"/>
+      <w:lvlJc w:val="left"/>
+      <w:pPr>
+        <w:ind w:left="19080" w:hanging="1800"/>
+      </w:pPr>
+      <w:rPr>
+        <w:rFonts w:hint="default"/>
+      </w:rPr>
+    </w:lvl>
+  </w:abstractNum>
+  <w:abstractNum w:abstractNumId="3" w15:restartNumberingAfterBreak="0">
+    <w:nsid w:val="164C1136"/>
+    <w:multiLevelType w:val="hybridMultilevel"/>
+    <w:tmpl w:val="DDD6E55C"/>
+    <w:lvl w:ilvl="0" w:tplc="708C0896">
+      <w:start w:val="1"/>
+      <w:numFmt w:val="decimal"/>
+      <w:lvlText w:val="%1."/>
+      <w:lvlJc w:val="left"/>
+      <w:pPr>
+        <w:ind w:left="1440" w:hanging="360"/>
+      </w:pPr>
+      <w:rPr>
+        <w:rFonts w:hint="default"/>
+      </w:rPr>
+    </w:lvl>
+    <w:lvl w:ilvl="1" w:tplc="04090019">
+      <w:start w:val="1"/>
+      <w:numFmt w:val="lowerLetter"/>
+      <w:lvlText w:val="%2."/>
+      <w:lvlJc w:val="left"/>
+      <w:pPr>
+        <w:ind w:left="2160" w:hanging="360"/>
+      </w:pPr>
+    </w:lvl>
+    <w:lvl w:ilvl="2" w:tplc="0409001B" w:tentative="1">
+      <w:start w:val="1"/>
+      <w:numFmt w:val="lowerRoman"/>
+      <w:lvlText w:val="%3."/>
+      <w:lvlJc w:val="right"/>
+      <w:pPr>
+        <w:ind w:left="2880" w:hanging="180"/>
+      </w:pPr>
+    </w:lvl>
+    <w:lvl w:ilvl="3" w:tplc="0409000F" w:tentative="1">
+      <w:start w:val="1"/>
+      <w:numFmt w:val="decimal"/>
+      <w:lvlText w:val="%4."/>
+      <w:lvlJc w:val="left"/>
+      <w:pPr>
+        <w:ind w:left="3600" w:hanging="360"/>
+      </w:pPr>
+    </w:lvl>
+    <w:lvl w:ilvl="4" w:tplc="04090019" w:tentative="1">
+      <w:start w:val="1"/>
+      <w:numFmt w:val="lowerLetter"/>
+      <w:lvlText w:val="%5."/>
+      <w:lvlJc w:val="left"/>
+      <w:pPr>
+        <w:ind w:left="4320" w:hanging="360"/>
+      </w:pPr>
+    </w:lvl>
+    <w:lvl w:ilvl="5" w:tplc="0409001B" w:tentative="1">
+      <w:start w:val="1"/>
+      <w:numFmt w:val="lowerRoman"/>
+      <w:lvlText w:val="%6."/>
+      <w:lvlJc w:val="right"/>
+      <w:pPr>
+        <w:ind w:left="5040" w:hanging="180"/>
+      </w:pPr>
+    </w:lvl>
+    <w:lvl w:ilvl="6" w:tplc="0409000F" w:tentative="1">
+      <w:start w:val="1"/>
+      <w:numFmt w:val="decimal"/>
+      <w:lvlText w:val="%7."/>
+      <w:lvlJc w:val="left"/>
+      <w:pPr>
+        <w:ind w:left="5760" w:hanging="360"/>
+      </w:pPr>
+    </w:lvl>
+    <w:lvl w:ilvl="7" w:tplc="04090019" w:tentative="1">
+      <w:start w:val="1"/>
+      <w:numFmt w:val="lowerLetter"/>
+      <w:lvlText w:val="%8."/>
+      <w:lvlJc w:val="left"/>
+      <w:pPr>
+        <w:ind w:left="6480" w:hanging="360"/>
+      </w:pPr>
+    </w:lvl>
+    <w:lvl w:ilvl="8" w:tplc="0409001B" w:tentative="1">
+      <w:start w:val="1"/>
+      <w:numFmt w:val="lowerRoman"/>
+      <w:lvlText w:val="%9."/>
+      <w:lvlJc w:val="right"/>
+      <w:pPr>
+        <w:ind w:left="7200" w:hanging="180"/>
+      </w:pPr>
+    </w:lvl>
+  </w:abstractNum>
+  <w:abstractNum w:abstractNumId="4" w15:restartNumberingAfterBreak="0">
     <w:nsid w:val="22775CE5"/>
     <w:multiLevelType w:val="hybridMultilevel"/>
     <w:tmpl w:val="021AE1A0"/>
@@ -569,7 +1765,7 @@
       </w:pPr>
     </w:lvl>
   </w:abstractNum>
-  <w:abstractNum w:abstractNumId="1" w15:restartNumberingAfterBreak="0">
+  <w:abstractNum w:abstractNumId="5" w15:restartNumberingAfterBreak="0">
     <w:nsid w:val="34816C78"/>
     <w:multiLevelType w:val="hybridMultilevel"/>
     <w:tmpl w:val="8390CA32"/>
@@ -682,7 +1878,7 @@
       </w:rPr>
     </w:lvl>
   </w:abstractNum>
-  <w:abstractNum w:abstractNumId="2" w15:restartNumberingAfterBreak="0">
+  <w:abstractNum w:abstractNumId="6" w15:restartNumberingAfterBreak="0">
     <w:nsid w:val="3E0178EE"/>
     <w:multiLevelType w:val="hybridMultilevel"/>
     <w:tmpl w:val="9B8233DC"/>
@@ -771,7 +1967,7 @@
       </w:pPr>
     </w:lvl>
   </w:abstractNum>
-  <w:abstractNum w:abstractNumId="3" w15:restartNumberingAfterBreak="0">
+  <w:abstractNum w:abstractNumId="7" w15:restartNumberingAfterBreak="0">
     <w:nsid w:val="404A0EAC"/>
     <w:multiLevelType w:val="multilevel"/>
     <w:tmpl w:val="965E2964"/>
@@ -893,15 +2089,27 @@
     </w:lvl>
   </w:abstractNum>
   <w:num w:numId="1" w16cid:durableId="1280264806">
+    <w:abstractNumId w:val="4"/>
+  </w:num>
+  <w:num w:numId="2" w16cid:durableId="930698526">
+    <w:abstractNumId w:val="6"/>
+  </w:num>
+  <w:num w:numId="3" w16cid:durableId="615865615">
+    <w:abstractNumId w:val="7"/>
+  </w:num>
+  <w:num w:numId="4" w16cid:durableId="2091387993">
+    <w:abstractNumId w:val="5"/>
+  </w:num>
+  <w:num w:numId="5" w16cid:durableId="1574437088">
+    <w:abstractNumId w:val="3"/>
+  </w:num>
+  <w:num w:numId="6" w16cid:durableId="1738238067">
     <w:abstractNumId w:val="0"/>
   </w:num>
-  <w:num w:numId="2" w16cid:durableId="930698526">
+  <w:num w:numId="7" w16cid:durableId="1056584721">
     <w:abstractNumId w:val="2"/>
   </w:num>
-  <w:num w:numId="3" w16cid:durableId="615865615">
-    <w:abstractNumId w:val="3"/>
-  </w:num>
-  <w:num w:numId="4" w16cid:durableId="2091387993">
+  <w:num w:numId="8" w16cid:durableId="483011431">
     <w:abstractNumId w:val="1"/>
   </w:num>
 </w:numbering>
@@ -2120,4 +3328,16 @@
     </a:ext>
   </a:extLst>
 </a:theme>
+</file>
+
+<file path=customXml/item1.xml><?xml version="1.0" encoding="utf-8"?>
+<b:Sources xmlns:b="http://schemas.openxmlformats.org/officeDocument/2006/bibliography" xmlns="http://schemas.openxmlformats.org/officeDocument/2006/bibliography" SelectedStyle="\APASixthEditionOfficeOnline.xsl" StyleName="APA" Version="6"/>
+</file>
+
+<file path=customXml/itemProps1.xml><?xml version="1.0" encoding="utf-8"?>
+<ds:datastoreItem xmlns:ds="http://schemas.openxmlformats.org/officeDocument/2006/customXml" ds:itemID="{9724988F-C594-4887-8BC2-134BAC28A91E}">
+  <ds:schemaRefs>
+    <ds:schemaRef ds:uri="http://schemas.openxmlformats.org/officeDocument/2006/bibliography"/>
+  </ds:schemaRefs>
+</ds:datastoreItem>
 </file>
</xml_diff>